<commit_message>
task130 v3 repair 1: leak gate (implementation plan distractor, no evaluation-only line), pins (birth-month claims, CARC 18 duplicates, PBM processing window), realism (clinical coherence, catalogues, calendar, adjudication, containers, signatures); golden programme baseline $3,916 PMPM (medical $2,227, pharmacy $1,689); checks 5,972 pass, verifier green, rebuilds byte-identical, leak.py no LEAK
Co-Authored-By: Claude Opus 5.5 <noreply@anthropic.com>
Claude-Session: https://claude.ai/code/session_01A6XcFx5t62c7gPi1bBKcVi
</commit_message>
<xml_diff>
--- a/task130/golden/baseline_certification_memo.docx
+++ b/task130/golden/baseline_certification_memo.docx
@@ -220,7 +220,7 @@
           <w:i w:val="0"/>
           <w:sz w:val="21"/>
         </w:rPr>
-        <w:t>I recommend that the Board approve a programme baseline of $3,541 per member per month for the 140 members Northcourt enrolls on 1 April: $2,157 for medical claims and $1,384 for pharmacy. Northcourt's 40 per cent share of savings will be measured against the tier baselines that make it up, under Schedule C of the agreement the Board approved on 9 February.</w:t>
+        <w:t>I recommend that the Board approve a programme baseline of $3,916 per member per month for the 140 members Northcourt enrolls on 1 April: $2,227 for medical claims and $1,689 for pharmacy. Northcourt's 40 per cent share of savings will be measured against the tier baselines that make it up, under Schedule C of the agreement the Board approved on 9 February.</w:t>
       </w:r>
     </w:p>
     <w:p>
@@ -233,7 +233,7 @@
           <w:i w:val="0"/>
           <w:sz w:val="21"/>
         </w:rPr>
-        <w:t>These members are on the list because 2026 was an expensive year for them, and for many it was the year of a transplant, a premature baby, a cancer course or an accident that will not repeat. Northcourt ran the same model on our 2024 claims for its 2025 proposal, and because the Board suspended that award none of those 140 members was ever enrolled. Their claims from April 2025 to March 2026 show what a member the model flags costs in the following year without the programme, so each tier's baseline is that group's allowed claims per member month, counted for the months they were covered and brought forward 24 months at the 6.5 per cent medical and 9.0 per cent pharmacy trend in the February renewal. The four tiers are weighted by the members Northcourt enrolled in each.</w:t>
+        <w:t>These members are on the list because 2026 was an expensive year for them, and for most it was the year of an operation, a heart attack, pneumonia, a cancer course or a premature birth that will not repeat. Northcourt ran the same model on our 2024 claims for its 2025 proposal, and because the Board suspended that award none of those 140 members was ever enrolled. Their claims from April 2025 to March 2026 show what a member the model flags costs in the following year without the programme, so each tier's baseline is that group's allowed claims per member month, counted for the months they were covered and brought forward 24 months at the 6.5 per cent medical and 9.0 per cent pharmacy trend in the February renewal. The four tiers are weighted by the members Northcourt enrolled in each.</w:t>
       </w:r>
     </w:p>
     <w:p>
@@ -246,7 +246,7 @@
           <w:i w:val="0"/>
           <w:sz w:val="21"/>
         </w:rPr>
-        <w:t>Carrying the enrolled members' own 2026 claims forward at trend would have produced $8,928, 2.5 times the figure above, and we would have paid Northcourt a share of savings that were always going to happen.</w:t>
+        <w:t>Carrying the enrolled members' own 2026 claims forward at trend would have produced $8,895, 2.3 times the figure above, and we would have paid Northcourt a share of savings that were always going to happen.</w:t>
       </w:r>
     </w:p>
     <w:p>

</xml_diff>